<commit_message>
feat(kredit): Daşınmaz ipoteka (Tek) hüquqi şəxs bəndi + tip seçimi auto
- Daşınmaz Əmlak ipoteka müqaviləsi (owner=borcalan, Tek şablon): girov
  sahibi kimlik bəndi {k_kimlik}-ə yığıldı — kredit müqaviləsi ilə eyni
  legal-aware davranış (hüquqi şəxs → VÖEN + direktor). Şablon dəyəri
  ortaq {k_kimlik} tokenindən gəlir, controller dəyişmədi.
- Index: "Müqavilə tipi" seçici dəyişəndə avtomatik submit — Göstər
  düyməsini gözləmədən tip dərhal tətbiq olunur.

Co-Authored-By: Claude Opus 4.8 <noreply@anthropic.com>
Claude-Session: https://claude.ai/code/session_01H9rdztrqGAu2ptsyRx5tbS
</commit_message>
<xml_diff>
--- a/FinNex.UI/Files/Word/Kredit/Dasinmaz_emlak_ipoteka_muqavilesiTek.docx
+++ b/FinNex.UI/Files/Word/Kredit/Dasinmaz_emlak_ipoteka_muqavilesiTek.docx
@@ -507,36 +507,36 @@
           <w:szCs w:val="24"/>
           <w:lang w:val="az-Latn-AZ"/>
         </w:rPr>
-        <w:t>{k</w:t>
-      </w:r>
-      <w:r>
-        <w:rPr>
-          <w:rFonts w:ascii="Times New Roman" w:hAnsi="Times New Roman"/>
-          <w:b/>
-          <w:sz w:val="24"/>
-          <w:szCs w:val="24"/>
-          <w:lang w:val="az-Latn-AZ"/>
-        </w:rPr>
-        <w:t>_olke}</w:t>
-      </w:r>
-      <w:r>
-        <w:rPr>
-          <w:rFonts w:ascii="Times New Roman" w:hAnsi="Times New Roman"/>
-          <w:sz w:val="24"/>
-          <w:szCs w:val="24"/>
-          <w:lang w:val="az-Latn-AZ"/>
-        </w:rPr>
-        <w:t xml:space="preserve"> vətəndaşı </w:t>
-      </w:r>
-      <w:r>
-        <w:rPr>
-          <w:rFonts w:ascii="Times New Roman" w:hAnsi="Times New Roman"/>
-          <w:b/>
-          <w:sz w:val="24"/>
-          <w:szCs w:val="24"/>
-          <w:lang w:val="az-Latn-AZ"/>
-        </w:rPr>
-        <w:t>{k_saa}</w:t>
+        <w:t>{k_kimlik}</w:t>
+      </w:r>
+      <w:r>
+        <w:rPr>
+          <w:rFonts w:ascii="Times New Roman" w:hAnsi="Times New Roman"/>
+          <w:b/>
+          <w:sz w:val="24"/>
+          <w:szCs w:val="24"/>
+          <w:lang w:val="az-Latn-AZ"/>
+        </w:rPr>
+        <w:t/>
+      </w:r>
+      <w:r>
+        <w:rPr>
+          <w:rFonts w:ascii="Times New Roman" w:hAnsi="Times New Roman"/>
+          <w:sz w:val="24"/>
+          <w:szCs w:val="24"/>
+          <w:lang w:val="az-Latn-AZ"/>
+        </w:rPr>
+        <w:t xml:space="preserve"/>
+      </w:r>
+      <w:r>
+        <w:rPr>
+          <w:rFonts w:ascii="Times New Roman" w:hAnsi="Times New Roman"/>
+          <w:b/>
+          <w:sz w:val="24"/>
+          <w:szCs w:val="24"/>
+          <w:lang w:val="az-Latn-AZ"/>
+        </w:rPr>
+        <w:t/>
       </w:r>
       <w:r>
         <w:rPr>
@@ -545,44 +545,44 @@
           <w:szCs w:val="24"/>
           <w:lang w:val="ro-RO"/>
         </w:rPr>
-        <w:t xml:space="preserve"> (</w:t>
-      </w:r>
-      <w:r>
-        <w:rPr>
-          <w:rFonts w:ascii="Times New Roman" w:hAnsi="Times New Roman"/>
-          <w:sz w:val="24"/>
-          <w:szCs w:val="24"/>
-          <w:lang w:val="az-Latn-AZ"/>
-        </w:rPr>
-        <w:t>vəsiqə məlumatı:</w:t>
-      </w:r>
-      <w:r>
-        <w:rPr>
-          <w:rFonts w:ascii="Times New Roman" w:hAnsi="Times New Roman"/>
-          <w:sz w:val="24"/>
-          <w:szCs w:val="24"/>
-          <w:lang w:val="az-Latn-AZ"/>
-        </w:rPr>
-        <w:t xml:space="preserve"> </w:t>
-      </w:r>
-      <w:r>
-        <w:rPr>
-          <w:rFonts w:ascii="Times New Roman" w:hAnsi="Times New Roman"/>
-          <w:b/>
-          <w:sz w:val="24"/>
-          <w:szCs w:val="24"/>
-          <w:lang w:val="az-Latn-AZ"/>
-        </w:rPr>
-        <w:t>{k_ves}</w:t>
-      </w:r>
-      <w:r>
-        <w:rPr>
-          <w:rFonts w:ascii="Times New Roman" w:hAnsi="Times New Roman"/>
-          <w:sz w:val="24"/>
-          <w:szCs w:val="24"/>
-          <w:lang w:val="az-Latn-AZ"/>
-        </w:rPr>
-        <w:t xml:space="preserve">) bundan sonra </w:t>
+        <w:t xml:space="preserve"/>
+      </w:r>
+      <w:r>
+        <w:rPr>
+          <w:rFonts w:ascii="Times New Roman" w:hAnsi="Times New Roman"/>
+          <w:sz w:val="24"/>
+          <w:szCs w:val="24"/>
+          <w:lang w:val="az-Latn-AZ"/>
+        </w:rPr>
+        <w:t/>
+      </w:r>
+      <w:r>
+        <w:rPr>
+          <w:rFonts w:ascii="Times New Roman" w:hAnsi="Times New Roman"/>
+          <w:sz w:val="24"/>
+          <w:szCs w:val="24"/>
+          <w:lang w:val="az-Latn-AZ"/>
+        </w:rPr>
+        <w:t xml:space="preserve"/>
+      </w:r>
+      <w:r>
+        <w:rPr>
+          <w:rFonts w:ascii="Times New Roman" w:hAnsi="Times New Roman"/>
+          <w:b/>
+          <w:sz w:val="24"/>
+          <w:szCs w:val="24"/>
+          <w:lang w:val="az-Latn-AZ"/>
+        </w:rPr>
+        <w:t/>
+      </w:r>
+      <w:r>
+        <w:rPr>
+          <w:rFonts w:ascii="Times New Roman" w:hAnsi="Times New Roman"/>
+          <w:sz w:val="24"/>
+          <w:szCs w:val="24"/>
+          <w:lang w:val="az-Latn-AZ"/>
+        </w:rPr>
+        <w:t xml:space="preserve"> bundan sonra </w:t>
       </w:r>
       <w:r>
         <w:rPr>

</xml_diff>